<commit_message>
feat: integrar reportes y documentar entrega frontend de fase 3
</commit_message>
<xml_diff>
--- a/docs/angular-components/Documentacion_Componentes_Angular.docx
+++ b/docs/angular-components/Documentacion_Componentes_Angular.docx
@@ -2,6 +2,396 @@
 <file path=word/document.xml><?xml version="1.0" encoding="utf-8"?>
 <w:document xmlns:wpc="http://schemas.microsoft.com/office/word/2010/wordprocessingCanvas" xmlns:mo="http://schemas.microsoft.com/office/mac/office/2008/main" xmlns:mc="http://schemas.openxmlformats.org/markup-compatibility/2006" xmlns:mv="urn:schemas-microsoft-com:mac:vml" xmlns:o="urn:schemas-microsoft-com:office:office" xmlns:r="http://schemas.openxmlformats.org/officeDocument/2006/relationships" xmlns:m="http://schemas.openxmlformats.org/officeDocument/2006/math" xmlns:v="urn:schemas-microsoft-com:vml" xmlns:wp14="http://schemas.microsoft.com/office/word/2010/wordprocessingDrawing" xmlns:wp="http://schemas.openxmlformats.org/drawingml/2006/wordprocessingDrawing" xmlns:w10="urn:schemas-microsoft-com:office:word" xmlns:w="http://schemas.openxmlformats.org/wordprocessingml/2006/main" xmlns:w14="http://schemas.microsoft.com/office/word/2010/wordml" xmlns:wpg="http://schemas.microsoft.com/office/word/2010/wordprocessingGroup" xmlns:wpi="http://schemas.microsoft.com/office/word/2010/wordprocessingInk" xmlns:wne="http://schemas.microsoft.com/office/word/2006/wordml" xmlns:wps="http://schemas.microsoft.com/office/word/2010/wordprocessingShape" mc:Ignorable="w14 wp14">
   <w:body>
+    <w:p>
+      <w:pPr>
+        <w:pStyle w:val="Title"/>
+      </w:pPr>
+      <w:r>
+        <w:t>Documentación de Componentes Angular — Fase 3</w:t>
+      </w:r>
+    </w:p>
+    <w:p>
+      <w:r>
+        <w:t>Climate Monitoring System</w:t>
+        <w:br/>
+        <w:t>Entrega de Fase 3 — 21 de octubre de 2026</w:t>
+      </w:r>
+    </w:p>
+    <w:p>
+      <w:r>
+        <w:t>Estado: implementación funcional validada localmente. VPS y conservación de históricos excluidos del alcance acordado. Credenciales y archivos privados de entorno no forman parte de esta entrega.</w:t>
+      </w:r>
+    </w:p>
+    <w:p>
+      <w:pPr>
+        <w:pStyle w:val="Heading1"/>
+      </w:pPr>
+      <w:r>
+        <w:t>Contenido de la entrega</w:t>
+      </w:r>
+    </w:p>
+    <w:p>
+      <w:pPr>
+        <w:pStyle w:val="ListBullet"/>
+      </w:pPr>
+      <w:r>
+        <w:t>FASE 3 ENTREGA</w:t>
+      </w:r>
+    </w:p>
+    <w:p>
+      <w:r>
+        <w:br w:type="page"/>
+      </w:r>
+    </w:p>
+    <w:p>
+      <w:pPr>
+        <w:pStyle w:val="Heading2"/>
+      </w:pPr>
+      <w:r>
+        <w:t>Entrega de Fase 3 — Frontend Angular</w:t>
+      </w:r>
+    </w:p>
+    <w:p>
+      <w:r>
+        <w:t>Fecha: 21 de octubre de 2026. Angular 22.2.3 y TypeScript 6.0.3. Se conserva el sistema existente y se integra reportería con la nueva arquitectura de microservicios.</w:t>
+      </w:r>
+    </w:p>
+    <w:p>
+      <w:pPr>
+        <w:pStyle w:val="Heading3"/>
+      </w:pPr>
+      <w:r>
+        <w:t>Arquitectura y componentes</w:t>
+      </w:r>
+    </w:p>
+    <w:p>
+      <w:r>
+        <w:t>Angular consume REST y SignalR mediante el Gateway. La configuración pública se obtiene de /runtime-config.json; no contiene contraseñas ni claves internas. Se mantienen login, dashboard, monitoreo, sensores, comunidades, alertas, eventos, usuarios y auditoría.</w:t>
+      </w:r>
+    </w:p>
+    <w:p>
+      <w:r>
+        <w:t>El módulo src/app/features/reports contiene API tipada, formulario de generación, historial paginado, seguimiento de trabajos, detalle y descarga. Las rutas están en src/app/app.routes.ts y la navegación en src/app/core/layout/navigation.model.ts. Los guards y controles visuales complementan los permisos verificados por el backend.</w:t>
+      </w:r>
+    </w:p>
+    <w:p>
+      <w:pPr>
+        <w:pStyle w:val="Heading3"/>
+      </w:pPr>
+      <w:r>
+        <w:t>Reportes PDF y permisos</w:t>
+      </w:r>
+    </w:p>
+    <w:p>
+      <w:r>
+        <w:t>Se entregan ocho tipos: comunidades, sensores, lecturas, alertas, eventos, estado de sensores, estadísticas climáticas y resumen ejecutivo. Los filtros por comunidad, sensor y fechas se muestran según el tipo. Se validan rangos antes del envío y se diferencian estados de carga, vacío, error y éxito.</w:t>
+      </w:r>
+    </w:p>
+    <w:p>
+      <w:r>
+        <w:t>El frontend solicita un trabajo persistente, consulta su estado y muestra el resultado. No accede directamente al almacenamiento privado del PDF. El servidor aplica límites, retención y recuperación de trabajos interrumpidos.</w:t>
+      </w:r>
+    </w:p>
+    <w:tbl>
+      <w:tblPr>
+        <w:tblStyle w:val="TableGrid"/>
+        <w:tblW w:type="auto" w:w="0"/>
+        <w:tblLook w:firstColumn="1" w:firstRow="1" w:lastColumn="0" w:lastRow="0" w:noHBand="0" w:noVBand="1" w:val="04A0"/>
+      </w:tblPr>
+      <w:tblGrid>
+        <w:gridCol w:w="2160"/>
+        <w:gridCol w:w="2160"/>
+        <w:gridCol w:w="2160"/>
+        <w:gridCol w:w="2160"/>
+      </w:tblGrid>
+      <w:tr>
+        <w:tc>
+          <w:tcPr>
+            <w:tcW w:type="dxa" w:w="2160"/>
+          </w:tcPr>
+          <w:p>
+            <w:r>
+              <w:t>Rol</w:t>
+            </w:r>
+          </w:p>
+        </w:tc>
+        <w:tc>
+          <w:tcPr>
+            <w:tcW w:type="dxa" w:w="2160"/>
+          </w:tcPr>
+          <w:p>
+            <w:r>
+              <w:t>Generación</w:t>
+            </w:r>
+          </w:p>
+        </w:tc>
+        <w:tc>
+          <w:tcPr>
+            <w:tcW w:type="dxa" w:w="2160"/>
+          </w:tcPr>
+          <w:p>
+            <w:r>
+              <w:t>Consulta</w:t>
+            </w:r>
+          </w:p>
+        </w:tc>
+        <w:tc>
+          <w:tcPr>
+            <w:tcW w:type="dxa" w:w="2160"/>
+          </w:tcPr>
+          <w:p>
+            <w:r>
+              <w:t>Descarga</w:t>
+            </w:r>
+          </w:p>
+        </w:tc>
+      </w:tr>
+      <w:tr>
+        <w:tc>
+          <w:tcPr>
+            <w:tcW w:type="dxa" w:w="2160"/>
+          </w:tcPr>
+          <w:p>
+            <w:r>
+              <w:t>Administrator</w:t>
+            </w:r>
+          </w:p>
+        </w:tc>
+        <w:tc>
+          <w:tcPr>
+            <w:tcW w:type="dxa" w:w="2160"/>
+          </w:tcPr>
+          <w:p>
+            <w:r>
+              <w:t>Sí</w:t>
+            </w:r>
+          </w:p>
+        </w:tc>
+        <w:tc>
+          <w:tcPr>
+            <w:tcW w:type="dxa" w:w="2160"/>
+          </w:tcPr>
+          <w:p>
+            <w:r>
+              <w:t>Todos</w:t>
+            </w:r>
+          </w:p>
+        </w:tc>
+        <w:tc>
+          <w:tcPr>
+            <w:tcW w:type="dxa" w:w="2160"/>
+          </w:tcPr>
+          <w:p>
+            <w:r>
+              <w:t>Sí</w:t>
+            </w:r>
+          </w:p>
+        </w:tc>
+      </w:tr>
+      <w:tr>
+        <w:tc>
+          <w:tcPr>
+            <w:tcW w:type="dxa" w:w="2160"/>
+          </w:tcPr>
+          <w:p>
+            <w:r>
+              <w:t>Operator</w:t>
+            </w:r>
+          </w:p>
+        </w:tc>
+        <w:tc>
+          <w:tcPr>
+            <w:tcW w:type="dxa" w:w="2160"/>
+          </w:tcPr>
+          <w:p>
+            <w:r>
+              <w:t>Sí</w:t>
+            </w:r>
+          </w:p>
+        </w:tc>
+        <w:tc>
+          <w:tcPr>
+            <w:tcW w:type="dxa" w:w="2160"/>
+          </w:tcPr>
+          <w:p>
+            <w:r>
+              <w:t>Propios</w:t>
+            </w:r>
+          </w:p>
+        </w:tc>
+        <w:tc>
+          <w:tcPr>
+            <w:tcW w:type="dxa" w:w="2160"/>
+          </w:tcPr>
+          <w:p>
+            <w:r>
+              <w:t>No</w:t>
+            </w:r>
+          </w:p>
+        </w:tc>
+      </w:tr>
+      <w:tr>
+        <w:tc>
+          <w:tcPr>
+            <w:tcW w:type="dxa" w:w="2160"/>
+          </w:tcPr>
+          <w:p>
+            <w:r>
+              <w:t>Viewer</w:t>
+            </w:r>
+          </w:p>
+        </w:tc>
+        <w:tc>
+          <w:tcPr>
+            <w:tcW w:type="dxa" w:w="2160"/>
+          </w:tcPr>
+          <w:p>
+            <w:r>
+              <w:t>No</w:t>
+            </w:r>
+          </w:p>
+        </w:tc>
+        <w:tc>
+          <w:tcPr>
+            <w:tcW w:type="dxa" w:w="2160"/>
+          </w:tcPr>
+          <w:p>
+            <w:r>
+              <w:t>Propios</w:t>
+            </w:r>
+          </w:p>
+        </w:tc>
+        <w:tc>
+          <w:tcPr>
+            <w:tcW w:type="dxa" w:w="2160"/>
+          </w:tcPr>
+          <w:p>
+            <w:r>
+              <w:t>No</w:t>
+            </w:r>
+          </w:p>
+        </w:tc>
+      </w:tr>
+    </w:tbl>
+    <w:p>
+      <w:r>
+        <w:t>Contratos públicos: /api/reports/types, /api/reports/generate, /api/reports, /api/reports/statistics, /api/reports/{id} y /api/reports/{id}/download.</w:t>
+      </w:r>
+    </w:p>
+    <w:p>
+      <w:pPr>
+        <w:pStyle w:val="Heading3"/>
+      </w:pPr>
+      <w:r>
+        <w:t>Dashboard, simulación y auditoría</w:t>
+      </w:r>
+    </w:p>
+    <w:p>
+      <w:r>
+        <w:t>El dashboard incluye comunidades, sensores activos e inactivos, lecturas actuales, alertas por nivel, eventos por fenómeno, evolución y estadísticas de las últimas 24 horas por tipo y unidad: cantidad, promedio, mínimo y máximo. Se admite filtro de comunidad, actualizaciones SignalR y recuperación mediante REST.</w:t>
+      </w:r>
+    </w:p>
+    <w:p>
+      <w:r>
+        <w:t>Se restauraron tres comunidades de Guatemala, 15 sensores y 27 reglas mediante las APIs actuales. Se crean primeras lecturas para sensores sin datos y se inicia el simulador. Se comprobó que el historial aumentó de 45 a 60 lecturas, con 15 lecturas actuales y cinco grupos estadísticos. Repetir el seed no duplica catálogos ni sobrescribe registros existentes.</w:t>
+      </w:r>
+    </w:p>
+    <w:p>
+      <w:r>
+        <w:t>Auditoría utiliza el contrato FastAPI y paginación para mantener acceso al historial completo. Los controles de acceso se conservan.</w:t>
+      </w:r>
+    </w:p>
+    <w:p>
+      <w:pPr>
+        <w:pStyle w:val="Heading3"/>
+      </w:pPr>
+      <w:r>
+        <w:t>Ejecución local y demostración</w:t>
+      </w:r>
+    </w:p>
+    <w:p>
+      <w:r>
+        <w:t>Desde backend:</w:t>
+      </w:r>
+    </w:p>
+    <w:p>
+      <w:r>
+        <w:rPr>
+          <w:rFonts w:ascii="Consolas" w:hAnsi="Consolas"/>
+          <w:sz w:val="16"/>
+        </w:rPr>
+        <w:t>powershell -NoProfile -ExecutionPolicy Bypass -File scripts/Start-Phase3.ps1 -NoBuild</w:t>
+      </w:r>
+    </w:p>
+    <w:p>
+      <w:r>
+        <w:t>Omitir -NoBuild para construir las imágenes. Frontend http://localhost:4200; Gateway http://localhost:8080. Usuario inicial admin; contraseña en AUTH_ADMIN_SEED_PASSWORD del archivo privado .env.phase3.local. No publicar ese archivo. PHASE3_DEMO_ENABLED=false omite la carga automática sin borrar datos.</w:t>
+      </w:r>
+    </w:p>
+    <w:p>
+      <w:r>
+        <w:t>Para completar una carga interrumpida: scripts/Seed-Phase3Demo.ps1. Guía: backend/docs/FASE_3_DATOS_DEMO.md. No se necesita crear servicios nuevos ni reiniciar bases para retomar.</w:t>
+      </w:r>
+    </w:p>
+    <w:p>
+      <w:pPr>
+        <w:pStyle w:val="Heading3"/>
+      </w:pPr>
+      <w:r>
+        <w:t>Pruebas y evidencia</w:t>
+      </w:r>
+    </w:p>
+    <w:p>
+      <w:r>
+        <w:t>Durante el cierre funcional se aprobaron 56 pruebas frontend, lint y build de producción. Las pruebas de navegador cubren roles, login/logout, pantallas anteriores, reglas, foco, teclado, móvil y generación/descarga de PDF. Seis escaneos axe aislados y 16 sobre Compose real con etiquetas WCAG 2.2 AA no detectaron violaciones en los recorridos evaluados; esto no constituye certificación completa de accesibilidad.</w:t>
+      </w:r>
+    </w:p>
+    <w:p>
+      <w:r>
+        <w:t>Scripts: scripts/test-browser.mjs y scripts/test-reports-browser.mjs. Las pruebas integradas se coordinan desde backend y crean registros, por lo que deben ejecutarse en una pila de prueba. Evidencia: backend/docs/FASE_3_PRUEBAS.md y backend/docs/validation/phase3-demo.json.</w:t>
+      </w:r>
+    </w:p>
+    <w:p>
+      <w:r>
+        <w:t>Para desarrollo: Node compatible con Angular 22 (se validó Node 24.21), npm ci, npm run test:ci, npm run lint y npm run build.</w:t>
+      </w:r>
+    </w:p>
+    <w:p>
+      <w:pPr>
+        <w:pStyle w:val="Heading3"/>
+      </w:pPr>
+      <w:r>
+        <w:t>Entrega y exclusiones</w:t>
+      </w:r>
+    </w:p>
+    <w:p>
+      <w:r>
+        <w:t>La entrega comprende código, documentos Word y Markdown, configuración de contenedores y pruebas. VPS, transferencia de históricos del usuario, videos y publicaciones externas quedan excluidos por el alcance acordado. Kubernetes y el proveedor de identidad externo se entregan preparados; no representan un despliegue ni OAuth operativo, cuya continuación corresponde a Fase 4.</w:t>
+      </w:r>
+    </w:p>
+    <w:p>
+      <w:r>
+        <w:t>La documentación previa de componentes se conserva como anexo histórico del Word. Las versiones y decisiones de esta entrega prevalecen sobre ese anexo. La arquitectura actual emplea Auth NestJS/PostgreSQL, Community .NET/PostgreSQL, Alert Java/PostgreSQL y Audit/Report FastAPI/Mongo; Sensor, Monitoring y Event conservan SQL Server.</w:t>
+      </w:r>
+    </w:p>
+    <w:p>
+      <w:r>
+        <w:br w:type="page"/>
+      </w:r>
+    </w:p>
+    <w:p>
+      <w:pPr>
+        <w:pStyle w:val="Heading1"/>
+      </w:pPr>
+      <w:r>
+        <w:t>Anexo histórico — documentación anterior a Fase 3</w:t>
+      </w:r>
+    </w:p>
+    <w:p>
+      <w:r>
+        <w:t>Se conserva como referencia de construcción. Las versiones y decisiones vigentes se describen en la entrega de Fase 3 que precede a este anexo.</w:t>
+      </w:r>
+    </w:p>
     <w:p>
       <w:r>
         <w:t>Reporte generado por: Christopher Herrera</w:t>
@@ -22593,29 +22983,13 @@
     </w:p>
     <w:sectPr>
       <w:headerReference w:type="default" r:id="rId9"/>
-      <w:footerReference w:type="default" r:id="rId10"/>
-      <w:pgSz w:w="11909" w:h="16834"/>
-      <w:pgMar w:top="1080" w:right="1008" w:bottom="1080" w:left="1008" w:header="720" w:footer="720" w:gutter="0"/>
+      <w:pgSz w:w="12240" w:h="15840"/>
+      <w:pgMar w:top="1247" w:right="1800" w:bottom="1247" w:left="1800" w:header="720" w:footer="720" w:gutter="0"/>
       <w:cols w:space="720"/>
       <w:docGrid w:linePitch="360"/>
     </w:sectPr>
   </w:body>
 </w:document>
-</file>
-
-<file path=word/footer1.xml><?xml version="1.0" encoding="utf-8"?>
-<w:ftr xmlns:m="http://schemas.openxmlformats.org/officeDocument/2006/math" xmlns:mc="http://schemas.openxmlformats.org/markup-compatibility/2006" xmlns:mo="http://schemas.microsoft.com/office/mac/office/2008/main" xmlns:mv="urn:schemas-microsoft-com:mac:vml" xmlns:o="urn:schemas-microsoft-com:office:office" xmlns:r="http://schemas.openxmlformats.org/officeDocument/2006/relationships" xmlns:v="urn:schemas-microsoft-com:vml" xmlns:w10="urn:schemas-microsoft-com:office:word" xmlns:w14="http://schemas.microsoft.com/office/word/2010/wordml" xmlns:w="http://schemas.openxmlformats.org/wordprocessingml/2006/main" xmlns:wne="http://schemas.microsoft.com/office/word/2006/wordml" xmlns:wp14="http://schemas.microsoft.com/office/word/2010/wordprocessingDrawing" xmlns:wp="http://schemas.openxmlformats.org/drawingml/2006/wordprocessingDrawing" xmlns:wpc="http://schemas.microsoft.com/office/word/2010/wordprocessingCanvas" xmlns:wpg="http://schemas.microsoft.com/office/word/2010/wordprocessingGroup" xmlns:wpi="http://schemas.microsoft.com/office/word/2010/wordprocessingInk" xmlns:wps="http://schemas.microsoft.com/office/word/2010/wordprocessingShape" mc:Ignorable="w14 wp14">
-  <w:p>
-    <w:pPr>
-      <w:pStyle w:val="Footer"/>
-      <w:jc w:val="right"/>
-    </w:pPr>
-    <w:r>
-      <w:t xml:space="preserve">Página </w:t>
-    </w:r>
-    <w:fldSimple w:instr="PAGE"/>
-  </w:p>
-</w:ftr>
 </file>
 
 <file path=word/header1.xml><?xml version="1.0" encoding="utf-8"?>
@@ -22625,7 +22999,7 @@
       <w:pStyle w:val="Header"/>
     </w:pPr>
     <w:r>
-      <w:t>CLIMATE MONITORING SYSTEM | GUÍA DE ELEMENTOS ANGULAR</w:t>
+      <w:t>Climate Monitoring System — Fase 3</w:t>
     </w:r>
   </w:p>
 </w:hdr>
@@ -22995,7 +23369,7 @@
     <w:qFormat/>
     <w:rsid w:val="00FC693F"/>
     <w:rPr>
-      <w:rFonts w:ascii="Calibri" w:hAnsi="Calibri"/>
+      <w:rFonts w:ascii="Aptos" w:hAnsi="Aptos"/>
       <w:sz w:val="20"/>
     </w:rPr>
   </w:style>
@@ -23061,7 +23435,7 @@
       <w:rFonts w:asciiTheme="majorHAnsi" w:eastAsiaTheme="majorEastAsia" w:hAnsiTheme="majorHAnsi" w:cstheme="majorBidi"/>
       <w:b/>
       <w:bCs/>
-      <w:color w:val="155E75"/>
+      <w:color w:val="1F4E79"/>
       <w:sz w:val="28"/>
       <w:szCs w:val="28"/>
     </w:rPr>
@@ -23085,7 +23459,7 @@
       <w:rFonts w:asciiTheme="majorHAnsi" w:eastAsiaTheme="majorEastAsia" w:hAnsiTheme="majorHAnsi" w:cstheme="majorBidi"/>
       <w:b/>
       <w:bCs/>
-      <w:color w:val="155E75"/>
+      <w:color w:val="1F4E79"/>
       <w:sz w:val="26"/>
       <w:szCs w:val="26"/>
     </w:rPr>
@@ -23109,7 +23483,7 @@
       <w:rFonts w:asciiTheme="majorHAnsi" w:eastAsiaTheme="majorEastAsia" w:hAnsiTheme="majorHAnsi" w:cstheme="majorBidi"/>
       <w:b/>
       <w:bCs/>
-      <w:color w:val="155E75"/>
+      <w:color w:val="1F4E79"/>
     </w:rPr>
   </w:style>
   <w:style w:type="paragraph" w:styleId="Heading4">
@@ -23134,7 +23508,7 @@
       <w:bCs/>
       <w:i/>
       <w:iCs/>
-      <w:color w:val="4F81BD" w:themeColor="accent1"/>
+      <w:color w:val="1F4E79"/>
     </w:rPr>
   </w:style>
   <w:style w:type="paragraph" w:styleId="Heading5">
@@ -23348,7 +23722,7 @@
     </w:pPr>
     <w:rPr>
       <w:rFonts w:asciiTheme="majorHAnsi" w:eastAsiaTheme="majorEastAsia" w:hAnsiTheme="majorHAnsi" w:cstheme="majorBidi"/>
-      <w:color w:val="155E75"/>
+      <w:color w:val="17365D" w:themeColor="text2" w:themeShade="BF"/>
       <w:spacing w:val="5"/>
       <w:kern w:val="28"/>
       <w:sz w:val="52"/>

</xml_diff>